<commit_message>
feat(algo_catalog): Daftar Algoritma yang Diuji — melengkapi UK-1 KUK 1.1
- Katalog seed 128 entri / 225 kombinasi (8 kelas primitif) dengan status
  SP 800-131A, security strength SP 800-57 / FIPS 203-205; PERLU_VERIFIKASI
  untuk entri yang belum pasti
- Scraper NIST (ACVP, CAVP, SP 800-131A, SP 800-57, IR 8547) dengan robots.txt,
  jeda, User-Agent, cache; mode offline memakai seed
- Tiga opsi input (Link, File, Dropdown) + normalisasi alias ke ID kanonik,
  skor keyakinan, bukti, konfirmasi pengguna, dedup, peringatan otomatis
- Keluaran algorithms_under_test.yaml/.json, Daftar_Algoritma_Uji.md/.csv/.xlsx,
  ditautkan otomatis ke config/product_profile.yaml dan Bab 1 dokumen UK-1
- GUI Streamlit, CLI, halaman web katalog (deteksi via Pyodide), samples/
- Perbaikan: path absolut lokal tidak lagi ditulis ke keluaran UK-1
- 91 unit test baru (total 159)

Co-Authored-By: Claude Opus 5.5 <noreply@anthropic.com>
</commit_message>
<xml_diff>
--- a/outputs/uk1/aes_128/UK1_Dokumen_Penetapan_Metode.docx
+++ b/outputs/uk1/aes_128/UK1_Dokumen_Penetapan_Metode.docx
@@ -33,7 +33,7 @@
     </w:p>
     <w:p>
       <w:r>
-        <w:t xml:space="preserve">Dibangkitkan: 2026-09-30T23:04:20+07:00 · mode: full · objek: </w:t>
+        <w:t xml:space="preserve">Dibangkitkan: 2026-10-01T09:16:55+07:00 · mode: full · objek: </w:t>
       </w:r>
       <w:r>
         <w:rPr>
@@ -490,6 +490,28 @@
           </w:p>
         </w:tc>
       </w:tr>
+      <w:tr>
+        <w:tc>
+          <w:tcPr>
+            <w:tcW w:type="dxa" w:w="4320"/>
+          </w:tcPr>
+          <w:p>
+            <w:r>
+              <w:t>Daftar algoritma diuji (algo_catalog)</w:t>
+            </w:r>
+          </w:p>
+        </w:tc>
+        <w:tc>
+          <w:tcPr>
+            <w:tcW w:type="dxa" w:w="4320"/>
+          </w:tcPr>
+          <w:p>
+            <w:r>
+              <w:t>33 kombinasi (block_cipher=6; stream_cipher=2; hash=7; mac=4; pkc_kem=7; signature=6; drbg=1); 6 peringatan tinggi; AES-128-CTR termasuk daftar (strength 128, status acceptable) — algorithms_under_test.yaml</w:t>
+            </w:r>
+          </w:p>
+        </w:tc>
+      </w:tr>
     </w:tbl>
     <w:p/>
     <w:p>
@@ -10329,7 +10351,7 @@
           </w:tcPr>
           <w:p>
             <w:r>
-              <w:t>2,670.7</w:t>
+              <w:t>2,428.1</w:t>
             </w:r>
           </w:p>
         </w:tc>
@@ -10351,7 +10373,7 @@
           </w:tcPr>
           <w:p>
             <w:r>
-              <w:t>2,670.7</w:t>
+              <w:t>2,428.1</w:t>
             </w:r>
           </w:p>
         </w:tc>
@@ -10788,7 +10810,7 @@
           </w:tcPr>
           <w:p>
             <w:r>
-              <w:t>4.68 detik</w:t>
+              <w:t>5.15 detik</w:t>
             </w:r>
           </w:p>
         </w:tc>
@@ -10838,7 +10860,7 @@
           </w:tcPr>
           <w:p>
             <w:r>
-              <w:t>Estimasi 4.68 detik ≤ anggaran 24 jam</w:t>
+              <w:t>Estimasi 5.15 detik ≤ anggaran 24 jam</w:t>
             </w:r>
           </w:p>
         </w:tc>
@@ -10972,7 +10994,7 @@
           </w:tcPr>
           <w:p>
             <w:r>
-              <w:t>6.13 detik</w:t>
+              <w:t>6.75 detik</w:t>
             </w:r>
           </w:p>
         </w:tc>
@@ -11022,7 +11044,7 @@
           </w:tcPr>
           <w:p>
             <w:r>
-              <w:t>Estimasi 6.13 detik ≤ anggaran 24 jam</w:t>
+              <w:t>Estimasi 6.75 detik ≤ anggaran 24 jam</w:t>
             </w:r>
           </w:p>
         </w:tc>
@@ -11064,7 +11086,7 @@
           </w:tcPr>
           <w:p>
             <w:r>
-              <w:t>0.94 detik</w:t>
+              <w:t>1.03 detik</w:t>
             </w:r>
           </w:p>
         </w:tc>
@@ -11114,7 +11136,7 @@
           </w:tcPr>
           <w:p>
             <w:r>
-              <w:t>Estimasi 0.94 detik ≤ anggaran 24 jam</w:t>
+              <w:t>Estimasi 1.03 detik ≤ anggaran 24 jam</w:t>
             </w:r>
           </w:p>
         </w:tc>
@@ -11156,7 +11178,7 @@
           </w:tcPr>
           <w:p>
             <w:r>
-              <w:t>36.57 detik</w:t>
+              <w:t>40.22 detik</w:t>
             </w:r>
           </w:p>
         </w:tc>
@@ -11206,7 +11228,7 @@
           </w:tcPr>
           <w:p>
             <w:r>
-              <w:t>Estimasi 36.57 detik ≤ anggaran 24 jam</w:t>
+              <w:t>Estimasi 40.22 detik ≤ anggaran 24 jam</w:t>
             </w:r>
           </w:p>
         </w:tc>
@@ -11248,7 +11270,7 @@
           </w:tcPr>
           <w:p>
             <w:r>
-              <w:t>2^110.7 tahun</w:t>
+              <w:t>2^110.8 tahun</w:t>
             </w:r>
           </w:p>
         </w:tc>
@@ -11278,7 +11300,7 @@
           </w:tcPr>
           <w:p>
             <w:r>
-              <w:t>Trail/distinguisher diferensial pada 2–3 ronde tereduksi — 12.27 detik</w:t>
+              <w:t>Trail/distinguisher diferensial pada 2–3 ronde tereduksi — 13.50 detik</w:t>
             </w:r>
           </w:p>
         </w:tc>
@@ -11298,7 +11320,7 @@
           </w:tcPr>
           <w:p>
             <w:r>
-              <w:t>Versi penuh 2^110.7 tahun &gt; anggaran; versi tereduksi 12.27 detik</w:t>
+              <w:t>Versi penuh 2^110.8 tahun &gt; anggaran; versi tereduksi 13.50 detik</w:t>
             </w:r>
           </w:p>
         </w:tc>
@@ -11340,7 +11362,7 @@
           </w:tcPr>
           <w:p>
             <w:r>
-              <w:t>2^110.7 tahun</w:t>
+              <w:t>2^110.8 tahun</w:t>
             </w:r>
           </w:p>
         </w:tc>
@@ -11370,7 +11392,7 @@
           </w:tcPr>
           <w:p>
             <w:r>
-              <w:t>Aproksimasi linear 2–3 ronde tereduksi, verifikasi bias empiris — 49.08 detik</w:t>
+              <w:t>Aproksimasi linear 2–3 ronde tereduksi, verifikasi bias empiris — 53.98 detik</w:t>
             </w:r>
           </w:p>
         </w:tc>
@@ -11390,7 +11412,7 @@
           </w:tcPr>
           <w:p>
             <w:r>
-              <w:t>Versi penuh 2^110.7 tahun &gt; anggaran; versi tereduksi 49.08 detik</w:t>
+              <w:t>Versi penuh 2^110.8 tahun &gt; anggaran; versi tereduksi 53.98 detik</w:t>
             </w:r>
           </w:p>
         </w:tc>
@@ -11432,7 +11454,7 @@
           </w:tcPr>
           <w:p>
             <w:r>
-              <w:t>2^88.7 tahun</w:t>
+              <w:t>2^88.8 tahun</w:t>
             </w:r>
           </w:p>
         </w:tc>
@@ -11462,7 +11484,7 @@
           </w:tcPr>
           <w:p>
             <w:r>
-              <w:t>Integral 3–4 ronde (2^8 CP per Λ-set) + margin keamanan — 3.07 detik</w:t>
+              <w:t>Integral 3–4 ronde (2^8 CP per Λ-set) + margin keamanan — 3.37 detik</w:t>
             </w:r>
           </w:p>
         </w:tc>
@@ -11482,7 +11504,7 @@
           </w:tcPr>
           <w:p>
             <w:r>
-              <w:t>Versi penuh 2^88.7 tahun &gt; anggaran; versi tereduksi 3.07 detik</w:t>
+              <w:t>Versi penuh 2^88.8 tahun &gt; anggaran; versi tereduksi 3.37 detik</w:t>
             </w:r>
           </w:p>
         </w:tc>
@@ -11524,7 +11546,7 @@
           </w:tcPr>
           <w:p>
             <w:r>
-              <w:t>2^88.7 tahun</w:t>
+              <w:t>2^88.8 tahun</w:t>
             </w:r>
           </w:p>
         </w:tc>
@@ -11554,7 +11576,7 @@
           </w:tcPr>
           <w:p>
             <w:r>
-              <w:t>Pencarian kunci tereduksi (24 bit kunci tak diketahui) — validasi harness — 13.1 menit</w:t>
+              <w:t>Pencarian kunci tereduksi (24 bit kunci tak diketahui) — validasi harness — 14.4 menit</w:t>
             </w:r>
           </w:p>
         </w:tc>
@@ -11574,7 +11596,7 @@
           </w:tcPr>
           <w:p>
             <w:r>
-              <w:t>Versi penuh 2^88.7 tahun &gt; anggaran; versi tereduksi 13.1 menit</w:t>
+              <w:t>Versi penuh 2^88.8 tahun &gt; anggaran; versi tereduksi 14.4 menit</w:t>
             </w:r>
           </w:p>
         </w:tc>
@@ -11708,7 +11730,7 @@
           </w:tcPr>
           <w:p>
             <w:r>
-              <w:t>0.19 detik</w:t>
+              <w:t>0.21 detik</w:t>
             </w:r>
           </w:p>
         </w:tc>
@@ -11758,7 +11780,7 @@
           </w:tcPr>
           <w:p>
             <w:r>
-              <w:t>Estimasi 0.19 detik ≤ anggaran 24 jam</w:t>
+              <w:t>Estimasi 0.21 detik ≤ anggaran 24 jam</w:t>
             </w:r>
           </w:p>
         </w:tc>
@@ -11800,7 +11822,7 @@
           </w:tcPr>
           <w:p>
             <w:r>
-              <w:t>49.08 detik</w:t>
+              <w:t>53.98 detik</w:t>
             </w:r>
           </w:p>
         </w:tc>
@@ -11850,7 +11872,7 @@
           </w:tcPr>
           <w:p>
             <w:r>
-              <w:t>Estimasi 49.08 detik ≤ anggaran 24 jam</w:t>
+              <w:t>Estimasi 53.98 detik ≤ anggaran 24 jam</w:t>
             </w:r>
           </w:p>
         </w:tc>
@@ -11892,7 +11914,7 @@
           </w:tcPr>
           <w:p>
             <w:r>
-              <w:t>3.3 menit</w:t>
+              <w:t>3.6 menit</w:t>
             </w:r>
           </w:p>
         </w:tc>
@@ -11984,7 +12006,7 @@
           </w:tcPr>
           <w:p>
             <w:r>
-              <w:t>6.13 detik</w:t>
+              <w:t>6.75 detik</w:t>
             </w:r>
           </w:p>
         </w:tc>
@@ -12076,7 +12098,7 @@
           </w:tcPr>
           <w:p>
             <w:r>
-              <w:t>3.07 detik</w:t>
+              <w:t>3.37 detik</w:t>
             </w:r>
           </w:p>
         </w:tc>
@@ -12260,7 +12282,7 @@
           </w:tcPr>
           <w:p>
             <w:r>
-              <w:t>49.08 detik</w:t>
+              <w:t>53.98 detik</w:t>
             </w:r>
           </w:p>
         </w:tc>
@@ -12310,7 +12332,7 @@
           </w:tcPr>
           <w:p>
             <w:r>
-              <w:t>Estimasi 49.08 detik ≤ anggaran 24 jam</w:t>
+              <w:t>Estimasi 53.98 detik ≤ anggaran 24 jam</w:t>
             </w:r>
           </w:p>
         </w:tc>
@@ -12536,7 +12558,7 @@
           </w:tcPr>
           <w:p>
             <w:r>
-              <w:t>0.37 detik</w:t>
+              <w:t>0.40 detik</w:t>
             </w:r>
           </w:p>
         </w:tc>
@@ -12586,7 +12608,7 @@
           </w:tcPr>
           <w:p>
             <w:r>
-              <w:t>Estimasi 0.37 detik ≤ anggaran 24 jam</w:t>
+              <w:t>Estimasi 0.40 detik ≤ anggaran 24 jam</w:t>
             </w:r>
           </w:p>
         </w:tc>
@@ -12768,7 +12790,7 @@
           </w:tcPr>
           <w:p>
             <w:r>
-              <w:t>Skor 3.0 ≥ 1.0: relevan terhadap C-API. Estimasi 49.08 detik ≤ anggaran 24 jam</w:t>
+              <w:t>Skor 3.0 ≥ 1.0: relevan terhadap C-API. Estimasi 53.98 detik ≤ anggaran 24 jam</w:t>
             </w:r>
           </w:p>
         </w:tc>
@@ -12840,7 +12862,7 @@
           </w:tcPr>
           <w:p>
             <w:r>
-              <w:t>Skor 3.0 ≥ 1.0: relevan terhadap C-MODE. Estimasi 0.19 detik ≤ anggaran 24 jam</w:t>
+              <w:t>Skor 3.0 ≥ 1.0: relevan terhadap C-MODE. Estimasi 0.21 detik ≤ anggaran 24 jam</w:t>
             </w:r>
           </w:p>
         </w:tc>
@@ -12912,7 +12934,7 @@
           </w:tcPr>
           <w:p>
             <w:r>
-              <w:t>Skor 3.0 ≥ 1.0: relevan terhadap C-MODE. Estimasi 36.57 detik ≤ anggaran 24 jam</w:t>
+              <w:t>Skor 3.0 ≥ 1.0: relevan terhadap C-MODE. Estimasi 40.22 detik ≤ anggaran 24 jam</w:t>
             </w:r>
           </w:p>
         </w:tc>
@@ -12984,7 +13006,7 @@
           </w:tcPr>
           <w:p>
             <w:r>
-              <w:t>Skor 3.0 ≥ 1.0: relevan terhadap C-IMPL-TBL, C-PLAT. Estimasi 49.08 detik ≤ anggaran 24 jam</w:t>
+              <w:t>Skor 3.0 ≥ 1.0: relevan terhadap C-IMPL-TBL, C-PLAT. Estimasi 53.98 detik ≤ anggaran 24 jam</w:t>
             </w:r>
           </w:p>
         </w:tc>
@@ -13128,7 +13150,7 @@
           </w:tcPr>
           <w:p>
             <w:r>
-              <w:t>Skor 2.0 ≥ 1.0: relevan terhadap komponen OK (verifikasi). Estimasi 0.94 detik ≤ anggaran 24 jam</w:t>
+              <w:t>Skor 2.0 ≥ 1.0: relevan terhadap komponen OK (verifikasi). Estimasi 1.03 detik ≤ anggaran 24 jam</w:t>
             </w:r>
           </w:p>
         </w:tc>
@@ -13200,7 +13222,7 @@
           </w:tcPr>
           <w:p>
             <w:r>
-              <w:t>Skor 2.0 ≥ 1.0: relevan terhadap komponen OK (verifikasi). Estimasi 6.13 detik ≤ anggaran 24 jam</w:t>
+              <w:t>Skor 2.0 ≥ 1.0: relevan terhadap komponen OK (verifikasi). Estimasi 6.75 detik ≤ anggaran 24 jam</w:t>
             </w:r>
           </w:p>
         </w:tc>
@@ -13272,7 +13294,7 @@
           </w:tcPr>
           <w:p>
             <w:r>
-              <w:t>Skor 2.0 ≥ 1.0: relevan terhadap komponen OK (verifikasi). Estimasi 0.37 detik ≤ anggaran 24 jam</w:t>
+              <w:t>Skor 2.0 ≥ 1.0: relevan terhadap komponen OK (verifikasi). Estimasi 0.40 detik ≤ anggaran 24 jam</w:t>
             </w:r>
           </w:p>
         </w:tc>
@@ -13488,7 +13510,7 @@
           </w:tcPr>
           <w:p>
             <w:r>
-              <w:t>Skor 1.2 ≥ 1.0: relevan terhadap komponen OK (verifikasi). Versi penuh 2^110.7 tahun &gt; anggaran; versi tereduksi 12.27 detik</w:t>
+              <w:t>Skor 1.2 ≥ 1.0: relevan terhadap komponen OK (verifikasi). Versi penuh 2^110.8 tahun &gt; anggaran; versi tereduksi 13.50 detik</w:t>
             </w:r>
           </w:p>
         </w:tc>
@@ -13560,7 +13582,7 @@
           </w:tcPr>
           <w:p>
             <w:r>
-              <w:t>Skor 1.2 ≥ 1.0: relevan terhadap komponen OK (verifikasi). Versi penuh 2^88.7 tahun &gt; anggaran; versi tereduksi 3.07 detik</w:t>
+              <w:t>Skor 1.2 ≥ 1.0: relevan terhadap komponen OK (verifikasi). Versi penuh 2^88.8 tahun &gt; anggaran; versi tereduksi 3.37 detik</w:t>
             </w:r>
           </w:p>
         </w:tc>
@@ -13632,7 +13654,7 @@
           </w:tcPr>
           <w:p>
             <w:r>
-              <w:t>Skor 1.2 ≥ 1.0: relevan terhadap komponen OK (verifikasi). Versi penuh 2^110.7 tahun &gt; anggaran; versi tereduksi 49.08 detik</w:t>
+              <w:t>Skor 1.2 ≥ 1.0: relevan terhadap komponen OK (verifikasi). Versi penuh 2^110.8 tahun &gt; anggaran; versi tereduksi 53.98 detik</w:t>
             </w:r>
           </w:p>
         </w:tc>
@@ -13776,7 +13798,7 @@
           </w:tcPr>
           <w:p>
             <w:r>
-              <w:t>Wajib (kesesuaian standar / baseline keamanan). Estimasi 4.68 detik ≤ anggaran 24 jam</w:t>
+              <w:t>Wajib (kesesuaian standar / baseline keamanan). Estimasi 5.15 detik ≤ anggaran 24 jam</w:t>
             </w:r>
           </w:p>
         </w:tc>
@@ -14308,7 +14330,7 @@
           </w:tcPr>
           <w:p>
             <w:r>
-              <w:t>49.08 detik</w:t>
+              <w:t>53.98 detik</w:t>
             </w:r>
           </w:p>
         </w:tc>
@@ -14482,7 +14504,7 @@
           </w:tcPr>
           <w:p>
             <w:r>
-              <w:t>0.19 detik</w:t>
+              <w:t>0.21 detik</w:t>
             </w:r>
           </w:p>
         </w:tc>
@@ -14856,7 +14878,7 @@
           </w:tcPr>
           <w:p>
             <w:r>
-              <w:t>36.57 detik</w:t>
+              <w:t>40.22 detik</w:t>
             </w:r>
           </w:p>
         </w:tc>
@@ -15054,7 +15076,7 @@
           </w:tcPr>
           <w:p>
             <w:r>
-              <w:t>49.08 detik</w:t>
+              <w:t>53.98 detik</w:t>
             </w:r>
           </w:p>
         </w:tc>
@@ -15428,7 +15450,7 @@
           </w:tcPr>
           <w:p>
             <w:r>
-              <w:t>0.94 detik</w:t>
+              <w:t>1.03 detik</w:t>
             </w:r>
           </w:p>
         </w:tc>
@@ -15626,7 +15648,7 @@
           </w:tcPr>
           <w:p>
             <w:r>
-              <w:t>6.13 detik</w:t>
+              <w:t>6.75 detik</w:t>
             </w:r>
           </w:p>
         </w:tc>
@@ -15802,7 +15824,7 @@
           </w:tcPr>
           <w:p>
             <w:r>
-              <w:t>0.37 detik</w:t>
+              <w:t>0.40 detik</w:t>
             </w:r>
           </w:p>
         </w:tc>
@@ -16396,7 +16418,7 @@
           </w:tcPr>
           <w:p>
             <w:r>
-              <w:t>12.27 detik</w:t>
+              <w:t>13.50 detik</w:t>
             </w:r>
           </w:p>
         </w:tc>
@@ -16616,7 +16638,7 @@
           </w:tcPr>
           <w:p>
             <w:r>
-              <w:t>3.07 detik</w:t>
+              <w:t>3.37 detik</w:t>
             </w:r>
           </w:p>
         </w:tc>
@@ -16814,7 +16836,7 @@
           </w:tcPr>
           <w:p>
             <w:r>
-              <w:t>49.08 detik</w:t>
+              <w:t>53.98 detik</w:t>
             </w:r>
           </w:p>
         </w:tc>
@@ -17210,7 +17232,7 @@
           </w:tcPr>
           <w:p>
             <w:r>
-              <w:t>4.68 detik</w:t>
+              <w:t>5.15 detik</w:t>
             </w:r>
           </w:p>
         </w:tc>
@@ -18515,7 +18537,7 @@
           </w:tcPr>
           <w:p>
             <w:r>
-              <w:t>uk1_metode/profile.py, config/product_profile.yaml</w:t>
+              <w:t>uk1_metode/profile.py, config/product_profile.yaml, algo_catalog/ (Daftar Algoritma yang Diuji)</w:t>
             </w:r>
           </w:p>
         </w:tc>
@@ -18525,7 +18547,7 @@
           </w:tcPr>
           <w:p>
             <w:r>
-              <w:t>tests/test_uk1_ek1.py::test_kuk_1_1_*</w:t>
+              <w:t>tests/test_uk1_ek1.py::test_kuk_1_1_*, tests/test_algo_catalog.py</w:t>
             </w:r>
           </w:p>
         </w:tc>

</xml_diff>